<commit_message>
Blog: spell the GitHub account as YobieBenjamin in the clone links of Parts 1 and 3
Co-Authored-By: Claude Fable 5.1 <noreply@anthropic.com>
Claude-Session: https://claude.ai/code/session_01DkQpVYNjMdJtfzj74tR8ZC
</commit_message>
<xml_diff>
--- a/blog/02-the-chip-that-says-no-1-plain-english.docx
+++ b/blog/02-the-chip-that-says-no-1-plain-english.docx
@@ -457,12 +457,12 @@
       <w:r>
         <w:t xml:space="preserve">The code behind all of it runs today: one command, fifty-one tests, seventy-five attacks, under a minute, at </w:t>
       </w:r>
-      <w:hyperlink w:history="1" r:id="rIdrbmzxedv5-ix78cm3yvko">
+      <w:hyperlink w:history="1" r:id="rIdintpvvm4nfepkayarygcz">
         <w:r>
           <w:rPr>
             <w:rStyle w:val="Hyperlink"/>
           </w:rPr>
-          <w:t xml:space="preserve">github.com/yobiebenjamin/hardware-and-silicon</w:t>
+          <w:t xml:space="preserve">github.com/YobieBenjamin/hardware-and-silicon</w:t>
         </w:r>
       </w:hyperlink>
       <w:r>

</xml_diff>

<commit_message>
Blog: Part 2 rewritten in plain English with analogies; Part 1 voice pass
Part 2 now reads at about a sixth-grade level by Flesch-Kincaid while keeping the
biology (final common path, basal ganglia, amygdala low road, efference copy, Libet),
the physics of the one-bit release line, the 1972 reference monitor, IEC 61508/61511
and the formal claim. Each hard idea is carried by an everyday analogy: the stadium
gate, the parking brake, the bouncer at the only door, the smoke detector, the concert
ticket, airport security, the fire alarm and the fire marshal, the courier's signature
versus the wax seal, the nuclear plant's dumb trip system. The formula is stated as a
checklist in English before it appears in symbols. The author's own lines from his
marked-up copy are kept. No em dashes.

Part 1 gets a light first-person pass to match.

Co-Authored-By: Claude Fable 5.1 <noreply@anthropic.com>
Claude-Session: https://claude.ai/code/session_01DkQpVYNjMdJtfzj74tR8ZC
</commit_message>
<xml_diff>
--- a/blog/02-the-chip-that-says-no-1-plain-english.docx
+++ b/blog/02-the-chip-that-says-no-1-plain-english.docx
@@ -42,7 +42,7 @@
           <w:sz w:val="23"/>
           <w:szCs w:val="23"/>
         </w:rPr>
-        <w:t xml:space="preserve">You cannot trust an AI to police another AI. The thing that stops a bad action has to work like a reflex, and it has to live in the chip.</w:t>
+        <w:t xml:space="preserve">You cannot trust an AI to police another AI. I have sat in too many meetings where that was the plan. The thing that stops a bad action has to work like a reflex, and it has to live in the chip. There is a way to do this, and this post is the plain-English version of it.</w:t>
       </w:r>
     </w:p>
     <w:p>
@@ -92,7 +92,7 @@
         <w:spacing w:after="160" w:line="276" w:lineRule="auto"/>
       </w:pPr>
       <w:r>
-        <w:t xml:space="preserve">The first idea everyone has is to put a second AI in charge of watching the first one. It sounds smart. It does not work.</w:t>
+        <w:t xml:space="preserve">The first idea everyone has is to put a second AI in charge of watching the first one. I hear it in every boardroom. It sounds smart. It does not work.</w:t>
       </w:r>
     </w:p>
     <w:p>
@@ -126,6 +126,14 @@
       </w:pPr>
       <w:r>
         <w:t xml:space="preserve">Your body already solved this</w:t>
+      </w:r>
+    </w:p>
+    <w:p>
+      <w:pPr>
+        <w:spacing w:after="160" w:line="276" w:lineRule="auto"/>
+      </w:pPr>
+      <w:r>
+        <w:t xml:space="preserve">This is my favorite part, because I am a biology nerd and the body got here first.</w:t>
       </w:r>
     </w:p>
     <w:p>
@@ -333,7 +341,7 @@
         <w:spacing w:after="160" w:line="276" w:lineRule="auto"/>
       </w:pPr>
       <w:r>
-        <w:t xml:space="preserve">This is not science fiction. Consumer drones refused to fly into airports for a decade because of a map in their software. In 2025 one big maker changed that in the US from a hard stop to a warning. Nothing about the technology changed. The pattern works; "just a warning" is how it dies.</w:t>
+        <w:t xml:space="preserve">This is not science fiction. My own DJI drone refused to fly into airports for a decade because of a map in its software. In 2025 DJI changed that in the US from a hard stop to a warning. Nothing about the technology changed. The pattern works. "Just a warning" is how it dies.</w:t>
       </w:r>
     </w:p>
     <w:p>
@@ -357,7 +365,7 @@
         <w:spacing w:after="160" w:line="276" w:lineRule="auto"/>
       </w:pPr>
       <w:r>
-        <w:t xml:space="preserve">Now the honest part. This will not catch an AI that says something false, because no chip can know what is true. It will not stop a danger nobody thought to put on the list. The chip can check a target against a list; it cannot know whether the list is complete or up to date, and two sensors that agree are not two independent sensors if they can fail the same way. So every one of these systems comes with a written list of what it trusts and why. Stopping is not always the safe move either: a drone can simply not fire, but a robot holding something has to be told what its safe move is. And someone has to hold the keys, which is a human problem, not a chip problem. What it does is put a hard floor under the worst outcomes, no matter how smart or how wrong the AI is.</w:t>
+        <w:t xml:space="preserve">Now the honest part, because I would rather tell you the limits than oversell this. It will not catch an AI that says something false, because no chip can know what is true. It will not stop a danger nobody thought to put on the list. The chip can check a target against a list; it cannot know whether the list is complete or up to date, and two sensors that agree are not two independent sensors if they can fail the same way. So every one of these systems comes with a written list of what it trusts and why. Stopping is not always the safe move either: a drone can simply not fire, but a robot holding something has to be told what its safe move is. And someone has to hold the keys, which is a human problem, not a chip problem. What it does is put a hard floor under the worst outcomes, no matter how smart or how wrong the AI is.</w:t>
       </w:r>
     </w:p>
     <w:p>
@@ -463,9 +471,9 @@
         <w:spacing w:after="160" w:line="276" w:lineRule="auto"/>
       </w:pPr>
       <w:r>
-        <w:t xml:space="preserve">The code behind all of it runs today: one command, fifty-one tests, seventy-five attacks, under a minute, at </w:t>
-      </w:r>
-      <w:hyperlink w:history="1" r:id="rIdcb6fqei13silpwqgj0wgt">
+        <w:t xml:space="preserve">I am not asking anyone to trust the AI companies, or the AI. I am asking for a chip that does not care what the AI thinks. The code behind all of it runs today: one command, fifty-one tests, seventy-five attacks, under a minute, at </w:t>
+      </w:r>
+      <w:hyperlink w:history="1" r:id="rIdashshfo6f18jsaf90wodz">
         <w:r>
           <w:rPr>
             <w:rStyle w:val="Hyperlink"/>

</xml_diff>

<commit_message>
Parts 3 and 4: second-audit corrections
- The cost paragraph and table now use OpenTitan's published OTBN figure (17 ms per
  P-384 signature) and the three honest numbers: firmware a hundredth of a percent of
  GPU time, the signing engine a third busy with one signature per 50 ms window, at most
  67 ms of record latency; the earlier "four tenths of a percent" is named as a wish that
  the audit replaced
- Board ownership stated plainly: the system board, PCIe switch and DPU are the server
  maker's; the HGX baseboard is NVIDIA's and is reached through its connector; a soldered
  governor is an ask; NVSwitch partitions through Fabric Manager
- "Needs nothing from NVIDIA" narrowed to NVIDIA's silicon
- Rebuilt the .docx files

Co-Authored-By: Claude Fable 5.1 <noreply@anthropic.com>
Claude-Session: https://claude.ai/code/session_01DkQpVYNjMdJtfzj74tR8ZC
</commit_message>
<xml_diff>
--- a/blog/02-the-chip-that-says-no-1-plain-english.docx
+++ b/blog/02-the-chip-that-says-no-1-plain-english.docx
@@ -462,7 +462,7 @@
       <w:pPr>
         <w:spacing w:after="160" w:line="276" w:lineRule="auto"/>
       </w:pPr>
-      <w:hyperlink w:history="1" r:id="rIdar7ka7ajcjdeqevpr3yid">
+      <w:hyperlink w:history="1" r:id="rIdboauvqcddc5ggjycp3b-i">
         <w:r>
           <w:rPr>
             <w:rStyle w:val="Hyperlink"/>
@@ -473,7 +473,7 @@
       <w:r>
         <w:t xml:space="preserve"> makes the same argument with the names, numbers and papers. </w:t>
       </w:r>
-      <w:hyperlink w:history="1" r:id="rIdogeco8ivpv9rxev0sul5z">
+      <w:hyperlink w:history="1" r:id="rIdqf9ddpy_pvdvukaylwsz2">
         <w:r>
           <w:rPr>
             <w:rStyle w:val="Hyperlink"/>
@@ -484,7 +484,7 @@
       <w:r>
         <w:t xml:space="preserve"> is the design of the gate and the lock: what sits in the weapon, the bank or the robot at the far end, and how a permission is checked twice. </w:t>
       </w:r>
-      <w:hyperlink w:history="1" r:id="rIdymacfkaca5nttwmepyhgt">
+      <w:hyperlink w:history="1" r:id="rIdwnv_99fw3gqi6l4u82whk">
         <w:r>
           <w:rPr>
             <w:rStyle w:val="Hyperlink"/>
@@ -503,7 +503,7 @@
       <w:r>
         <w:t xml:space="preserve">I am not asking anyone to trust the AI companies, or the AI. I am asking for a chip that does not care what the AI thinks. The code behind all of it runs today: one command, fifty-one tests, seventy-five attacks, under a minute, at </w:t>
       </w:r>
-      <w:hyperlink w:history="1" r:id="rIdd6208lhwhw14hhlujo6jb">
+      <w:hyperlink w:history="1" r:id="rIdsgik1kiscmkz5g387kd7w">
         <w:r>
           <w:rPr>
             <w:rStyle w:val="Hyperlink"/>

</xml_diff>

<commit_message>
blog: Part 5, the follow-up to Parts 1 and 2: what the first experiments found, promising and not
The progress report on the software phase of the experiment program: what the Z3 proofs found
(two holes the 200 tests had missed), what the first wave built and what the gate found in it
(L4, L5, H1, YB-0052, each with its findings and its status), the catalogue count corrected, and
the observation the wave forced: the agents asserted results they had not shown, the model
reviewer could raise STOP but not clear it, and the merge needed the things a script checks and
a person with the keys, which is the argument of Parts 1 and 2 run back at small scale. Every
number is from audit/wave-1 and the reviews on the pull requests, linked. Built as .docx by
tools/build.js like the rest of the series; the README table has the new row.

Co-Authored-By: Claude Fable 5.1 <noreply@anthropic.com>
Claude-Session: https://claude.ai/code/session_01DkQpVYNjMdJtfzj74tR8ZC
</commit_message>
<xml_diff>
--- a/blog/02-the-chip-that-says-no-1-plain-english.docx
+++ b/blog/02-the-chip-that-says-no-1-plain-english.docx
@@ -462,7 +462,7 @@
       <w:pPr>
         <w:spacing w:after="160" w:line="276" w:lineRule="auto"/>
       </w:pPr>
-      <w:hyperlink w:history="1" r:id="rIdboauvqcddc5ggjycp3b-i">
+      <w:hyperlink w:history="1" r:id="rIdxeiroowvqdfvgpzh-xnci">
         <w:r>
           <w:rPr>
             <w:rStyle w:val="Hyperlink"/>
@@ -473,7 +473,7 @@
       <w:r>
         <w:t xml:space="preserve"> makes the same argument with the names, numbers and papers. </w:t>
       </w:r>
-      <w:hyperlink w:history="1" r:id="rIdqf9ddpy_pvdvukaylwsz2">
+      <w:hyperlink w:history="1" r:id="rId0ny8aymtxgq2tii4-8hrl">
         <w:r>
           <w:rPr>
             <w:rStyle w:val="Hyperlink"/>
@@ -484,7 +484,7 @@
       <w:r>
         <w:t xml:space="preserve"> is the design of the gate and the lock: what sits in the weapon, the bank or the robot at the far end, and how a permission is checked twice. </w:t>
       </w:r>
-      <w:hyperlink w:history="1" r:id="rIdwnv_99fw3gqi6l4u82whk">
+      <w:hyperlink w:history="1" r:id="rIdw3vgxh8hwaa9cqtvect4f">
         <w:r>
           <w:rPr>
             <w:rStyle w:val="Hyperlink"/>
@@ -503,7 +503,7 @@
       <w:r>
         <w:t xml:space="preserve">I am not asking anyone to trust the AI companies, or the AI. I am asking for a chip that does not care what the AI thinks. The code behind all of it runs today: one command, fifty-one tests, seventy-five attacks, under a minute, at </w:t>
       </w:r>
-      <w:hyperlink w:history="1" r:id="rIdsgik1kiscmkz5g387kd7w">
+      <w:hyperlink w:history="1" r:id="rIdnvs9rotuwxzhrgssqqonf">
         <w:r>
           <w:rPr>
             <w:rStyle w:val="Hyperlink"/>

</xml_diff>